<commit_message>
Refactor code structure and remove redundant changes
</commit_message>
<xml_diff>
--- a/Articles/2026/3_DaVinci_Tips_and_Tricks/8_How_to_Copy_and_Paste_Keyframes_in_DaVinci_Resolve_on_Edit_Page/8 How to Copy and Paste Keyframes - Edit.docx
+++ b/Articles/2026/3_DaVinci_Tips_and_Tricks/8_How_to_Copy_and_Paste_Keyframes_in_DaVinci_Resolve_on_Edit_Page/8 How to Copy and Paste Keyframes - Edit.docx
@@ -22,6 +22,75 @@
       <w:pPr>
         <w:pStyle w:val="SuedeBlue"/>
       </w:pPr>
+    </w:p>
+    <w:p>
+      <w:pPr>
+        <w:pStyle w:val="SuedeBlue"/>
+        <w:jc w:val="left"/>
+      </w:pPr>
+      <w:r>
+        <w:rPr>
+          <w:noProof/>
+        </w:rPr>
+        <w:drawing>
+          <wp:inline distT="0" distB="0" distL="0" distR="0" wp14:anchorId="52249562" wp14:editId="4E9F2306">
+            <wp:extent cx="2571750" cy="2295525"/>
+            <wp:effectExtent l="76200" t="76200" r="133350" b="142875"/>
+            <wp:docPr id="312482811" name="Picture 1"/>
+            <wp:cNvGraphicFramePr>
+              <a:graphicFrameLocks xmlns:a="http://schemas.openxmlformats.org/drawingml/2006/main" noChangeAspect="1"/>
+            </wp:cNvGraphicFramePr>
+            <a:graphic xmlns:a="http://schemas.openxmlformats.org/drawingml/2006/main">
+              <a:graphicData uri="http://schemas.openxmlformats.org/drawingml/2006/picture">
+                <pic:pic xmlns:pic="http://schemas.openxmlformats.org/drawingml/2006/picture">
+                  <pic:nvPicPr>
+                    <pic:cNvPr id="0" name="Picture 1"/>
+                    <pic:cNvPicPr>
+                      <a:picLocks noChangeAspect="1" noChangeArrowheads="1"/>
+                    </pic:cNvPicPr>
+                  </pic:nvPicPr>
+                  <pic:blipFill>
+                    <a:blip r:embed="rId7">
+                      <a:extLst>
+                        <a:ext uri="{28A0092B-C50C-407E-A947-70E740481C1C}">
+                          <a14:useLocalDpi xmlns:a14="http://schemas.microsoft.com/office/drawing/2010/main" val="0"/>
+                        </a:ext>
+                      </a:extLst>
+                    </a:blip>
+                    <a:srcRect/>
+                    <a:stretch>
+                      <a:fillRect/>
+                    </a:stretch>
+                  </pic:blipFill>
+                  <pic:spPr bwMode="auto">
+                    <a:xfrm>
+                      <a:off x="0" y="0"/>
+                      <a:ext cx="2571750" cy="2295525"/>
+                    </a:xfrm>
+                    <a:prstGeom prst="rect">
+                      <a:avLst/>
+                    </a:prstGeom>
+                    <a:ln w="38100" cap="sq">
+                      <a:solidFill>
+                        <a:srgbClr val="000000"/>
+                      </a:solidFill>
+                      <a:prstDash val="solid"/>
+                      <a:miter lim="800000"/>
+                    </a:ln>
+                    <a:effectLst>
+                      <a:outerShdw blurRad="50800" dist="38100" dir="2700000" algn="tl" rotWithShape="0">
+                        <a:srgbClr val="000000">
+                          <a:alpha val="43000"/>
+                        </a:srgbClr>
+                      </a:outerShdw>
+                    </a:effectLst>
+                  </pic:spPr>
+                </pic:pic>
+              </a:graphicData>
+            </a:graphic>
+          </wp:inline>
+        </w:drawing>
+      </w:r>
     </w:p>
     <w:p>
       <w:r>
@@ -59,7 +128,7 @@
                     <pic:cNvPicPr/>
                   </pic:nvPicPr>
                   <pic:blipFill>
-                    <a:blip r:embed="rId7"/>
+                    <a:blip r:embed="rId8"/>
                     <a:stretch>
                       <a:fillRect/>
                     </a:stretch>
@@ -80,22 +149,51 @@
         </w:drawing>
       </w:r>
     </w:p>
-    <w:p/>
     <w:p>
-      <w:r>
-        <w:t>Start bringing in your images to the Medial Pool, inside of DaVinci. We will use a background image on the bottom track and a text layer on the track over it.</w:t>
+      <w:pPr>
+        <w:pStyle w:val="Heading1"/>
+      </w:pPr>
+      <w:r>
+        <w:t>Set up for the Edit Page</w:t>
       </w:r>
     </w:p>
     <w:p>
       <w:r>
-        <w:rPr>
-          <w:noProof/>
-        </w:rPr>
+        <w:t>Start bringing in your images to the Media</w:t>
+      </w:r>
+      <w:r>
+        <w:t xml:space="preserve"> </w:t>
+      </w:r>
+      <w:r>
+        <w:t>Pool, inside of DaVinci. We will use a background image on the bottom track</w:t>
+      </w:r>
+      <w:r>
+        <w:t>,</w:t>
+      </w:r>
+      <w:r>
+        <w:t xml:space="preserve"> and </w:t>
+      </w:r>
+      <w:r>
+        <w:t xml:space="preserve">then </w:t>
+      </w:r>
+      <w:r>
+        <w:t>a</w:t>
+      </w:r>
+      <w:r>
+        <w:t>n image of a sugar bowl,</w:t>
+      </w:r>
+      <w:r>
+        <w:t xml:space="preserve"> on the track over it.</w:t>
+      </w:r>
+    </w:p>
+    <w:p>
+      <w:r>
+        <w:lastRenderedPageBreak/>
         <w:drawing>
-          <wp:inline distT="0" distB="0" distL="0" distR="0" wp14:anchorId="5E991CB0" wp14:editId="738C92B5">
-            <wp:extent cx="3438525" cy="2200275"/>
-            <wp:effectExtent l="76200" t="76200" r="142875" b="142875"/>
-            <wp:docPr id="457955924" name="Picture 1"/>
+          <wp:inline distT="0" distB="0" distL="0" distR="0" wp14:anchorId="765419E9" wp14:editId="1372FDC0">
+            <wp:extent cx="3629532" cy="2381582"/>
+            <wp:effectExtent l="0" t="0" r="9525" b="0"/>
+            <wp:docPr id="21137862" name="Picture 1"/>
             <wp:cNvGraphicFramePr>
               <a:graphicFrameLocks xmlns:a="http://schemas.openxmlformats.org/drawingml/2006/main" noChangeAspect="1"/>
             </wp:cNvGraphicFramePr>
@@ -103,60 +201,23 @@
               <a:graphicData uri="http://schemas.openxmlformats.org/drawingml/2006/picture">
                 <pic:pic xmlns:pic="http://schemas.openxmlformats.org/drawingml/2006/picture">
                   <pic:nvPicPr>
-                    <pic:cNvPr id="457955924" name=""/>
+                    <pic:cNvPr id="21137862" name=""/>
                     <pic:cNvPicPr/>
                   </pic:nvPicPr>
-                  <pic:blipFill rotWithShape="1">
-                    <a:blip r:embed="rId8"/>
-                    <a:srcRect l="2433" t="2532" b="-1"/>
+                  <pic:blipFill>
+                    <a:blip r:embed="rId9"/>
                     <a:stretch>
                       <a:fillRect/>
                     </a:stretch>
                   </pic:blipFill>
-                  <pic:spPr bwMode="auto">
+                  <pic:spPr>
                     <a:xfrm>
                       <a:off x="0" y="0"/>
-                      <a:ext cx="3439005" cy="2200582"/>
+                      <a:ext cx="3629532" cy="2381582"/>
                     </a:xfrm>
                     <a:prstGeom prst="rect">
                       <a:avLst/>
                     </a:prstGeom>
-                    <a:ln w="38100" cap="sq" cmpd="sng" algn="ctr">
-                      <a:solidFill>
-                        <a:srgbClr val="000000"/>
-                      </a:solidFill>
-                      <a:prstDash val="solid"/>
-                      <a:miter lim="800000"/>
-                      <a:headEnd type="none" w="med" len="med"/>
-                      <a:tailEnd type="none" w="med" len="med"/>
-                      <a:extLst>
-                        <a:ext uri="{C807C97D-BFC1-408E-A445-0C87EB9F89A2}">
-                          <ask:lineSketchStyleProps xmlns:ask="http://schemas.microsoft.com/office/drawing/2018/sketchyshapes" sd="0">
-                            <a:custGeom>
-                              <a:avLst/>
-                              <a:gdLst/>
-                              <a:ahLst/>
-                              <a:cxnLst/>
-                              <a:rect l="0" t="0" r="0" b="0"/>
-                              <a:pathLst/>
-                            </a:custGeom>
-                            <ask:type/>
-                          </ask:lineSketchStyleProps>
-                        </a:ext>
-                      </a:extLst>
-                    </a:ln>
-                    <a:effectLst>
-                      <a:outerShdw blurRad="50800" dist="38100" dir="2700000" algn="tl" rotWithShape="0">
-                        <a:srgbClr val="000000">
-                          <a:alpha val="43000"/>
-                        </a:srgbClr>
-                      </a:outerShdw>
-                    </a:effectLst>
-                    <a:extLst>
-                      <a:ext uri="{53640926-AAD7-44D8-BBD7-CCE9431645EC}">
-                        <a14:shadowObscured xmlns:a14="http://schemas.microsoft.com/office/drawing/2010/main"/>
-                      </a:ext>
-                    </a:extLst>
                   </pic:spPr>
                 </pic:pic>
               </a:graphicData>
@@ -168,8 +229,13 @@
     <w:p/>
     <w:p>
       <w:r>
-        <w:lastRenderedPageBreak/>
-        <w:t>Then drag your two layers down on the timeline</w:t>
+        <w:t xml:space="preserve">Then drag your two </w:t>
+      </w:r>
+      <w:r>
+        <w:t>images</w:t>
+      </w:r>
+      <w:r>
+        <w:t xml:space="preserve"> down on the timeline</w:t>
       </w:r>
     </w:p>
     <w:p>
@@ -193,7 +259,7 @@
                     <pic:cNvPicPr/>
                   </pic:nvPicPr>
                   <pic:blipFill>
-                    <a:blip r:embed="rId9"/>
+                    <a:blip r:embed="rId10"/>
                     <a:stretch>
                       <a:fillRect/>
                     </a:stretch>
@@ -231,7 +297,10 @@
     <w:p/>
     <w:p>
       <w:r>
-        <w:t>Now select the (in my case) the sugar bowl clip on your timeline. Start on Frame 1 to set your starting position. Always set a starting key frame on frame one, so DaVinci understands where it is starting from. And Davini will just start where you set your next key frame as a starting position, and you probably wanted some movement between these two frames, so that makes no sense.</w:t>
+        <w:t xml:space="preserve">Now select the (in my case) the sugar bowl clip on your timeline. Start on Frame 1 to set your starting position. Always set a starting key frame on frame one, so DaVinci understands where it is starting from. </w:t>
+      </w:r>
+      <w:r>
+        <w:t xml:space="preserve">or Davinci will just get confused. DaVinci needs 2 frames to work from in order to create some movement. </w:t>
       </w:r>
     </w:p>
     <w:p>
@@ -258,7 +327,7 @@
                     <pic:cNvPicPr/>
                   </pic:nvPicPr>
                   <pic:blipFill>
-                    <a:blip r:embed="rId10"/>
+                    <a:blip r:embed="rId11"/>
                     <a:stretch>
                       <a:fillRect/>
                     </a:stretch>
@@ -298,6 +367,7 @@
         <w:rPr>
           <w:noProof/>
         </w:rPr>
+        <w:lastRenderedPageBreak/>
         <w:drawing>
           <wp:inline distT="0" distB="0" distL="0" distR="0" wp14:anchorId="3BE8F31D" wp14:editId="26EEBBCA">
             <wp:extent cx="6105525" cy="1588028"/>
@@ -314,7 +384,7 @@
                     <pic:cNvPicPr/>
                   </pic:nvPicPr>
                   <pic:blipFill>
-                    <a:blip r:embed="rId11"/>
+                    <a:blip r:embed="rId12"/>
                     <a:stretch>
                       <a:fillRect/>
                     </a:stretch>
@@ -339,14 +409,22 @@
       <w:r>
         <w:t>We are starting with the sugar bowl off the left side of the screen and then animate it in. It is going to travel across the screen and leave the screen on the right side.</w:t>
       </w:r>
+      <w:r>
+        <w:t xml:space="preserve"> So, for frame 1 move the sugar bowl off to the left of the screen. Use the parameter for X and Y in the inspector to move the sugar bowl.</w:t>
+      </w:r>
     </w:p>
     <w:p>
       <w:r>
-        <w:t xml:space="preserve">Hit your diamond next to the parameter for X and Y. To start animating those positions. Notice the diamond is red after hitting it. This means the keyframe has been locked in and moving its position when </w:t>
-      </w:r>
-      <w:r>
-        <w:lastRenderedPageBreak/>
-        <w:t>we move the playhead to another position and setting a new keyframe with the new position, probably center screen, at midway through the video.</w:t>
+        <w:t>Hit your diamond next to the parameter for X and Y. To start animating those positions. Notice the diamond is red after hitting it. This means the keyframe has been locked in</w:t>
+      </w:r>
+      <w:r>
+        <w:t>.</w:t>
+      </w:r>
+      <w:r>
+        <w:t xml:space="preserve"> </w:t>
+      </w:r>
+      <w:r>
+        <w:t>With the diamond locked in at frame 1, DaVinci knows we want to animate. Now move the playhead to a new position, and change the X and Y position. You will notice that it will now just automatically start turning the diamond red. Keep moving playhead, and setting a new position, until we finish animating the entire video.</w:t>
       </w:r>
     </w:p>
     <w:p>
@@ -370,7 +448,7 @@
                     <pic:cNvPicPr/>
                   </pic:nvPicPr>
                   <pic:blipFill>
-                    <a:blip r:embed="rId12"/>
+                    <a:blip r:embed="rId13"/>
                     <a:stretch>
                       <a:fillRect/>
                     </a:stretch>
@@ -393,7 +471,25 @@
     </w:p>
     <w:p>
       <w:r>
-        <w:t xml:space="preserve"> Remember to set your last key frame. And now we can open the Keyframe panel on the Edit page.</w:t>
+        <w:t xml:space="preserve"> Remember to set your last key frame. And now we can open the </w:t>
+      </w:r>
+      <w:r>
+        <w:rPr>
+          <w:rStyle w:val="Strong"/>
+        </w:rPr>
+        <w:t>Keyframe</w:t>
+      </w:r>
+      <w:r>
+        <w:t xml:space="preserve"> panel on the </w:t>
+      </w:r>
+      <w:r>
+        <w:rPr>
+          <w:rStyle w:val="Strong"/>
+        </w:rPr>
+        <w:t>Edit</w:t>
+      </w:r>
+      <w:r>
+        <w:t xml:space="preserve"> page.</w:t>
       </w:r>
     </w:p>
     <w:p>
@@ -401,6 +497,7 @@
         <w:rPr>
           <w:noProof/>
         </w:rPr>
+        <w:lastRenderedPageBreak/>
         <w:drawing>
           <wp:inline distT="0" distB="0" distL="0" distR="0" wp14:anchorId="44FDCFBA" wp14:editId="2C015125">
             <wp:extent cx="5943600" cy="2347595"/>
@@ -417,7 +514,7 @@
                     <pic:cNvPicPr/>
                   </pic:nvPicPr>
                   <pic:blipFill>
-                    <a:blip r:embed="rId13"/>
+                    <a:blip r:embed="rId14"/>
                     <a:stretch>
                       <a:fillRect/>
                     </a:stretch>
@@ -440,7 +537,19 @@
     </w:p>
     <w:p>
       <w:r>
-        <w:t>To see the same thing that I have above, turn on these icons. The first shows the Parameter names, and the second icon lets you see the diamonds representing the keyframes.</w:t>
+        <w:t xml:space="preserve">To see the same thing that I have above, turn on these icons. The first shows the Parameter names, and the </w:t>
+      </w:r>
+      <w:r>
+        <w:t xml:space="preserve">third </w:t>
+      </w:r>
+      <w:r>
+        <w:t xml:space="preserve">icon </w:t>
+      </w:r>
+      <w:r>
+        <w:t xml:space="preserve">(which I selected) </w:t>
+      </w:r>
+      <w:r>
+        <w:t>lets you see the diamonds representing the keyframes.</w:t>
       </w:r>
     </w:p>
     <w:p>
@@ -448,7 +557,6 @@
         <w:rPr>
           <w:noProof/>
         </w:rPr>
-        <w:lastRenderedPageBreak/>
         <w:drawing>
           <wp:inline distT="0" distB="0" distL="0" distR="0" wp14:anchorId="5EEB2AEA" wp14:editId="7EDA3F6D">
             <wp:extent cx="3924848" cy="1571844"/>
@@ -465,7 +573,7 @@
                     <pic:cNvPicPr/>
                   </pic:nvPicPr>
                   <pic:blipFill>
-                    <a:blip r:embed="rId14"/>
+                    <a:blip r:embed="rId15"/>
                     <a:stretch>
                       <a:fillRect/>
                     </a:stretch>
@@ -488,7 +596,19 @@
     </w:p>
     <w:p>
       <w:r>
-        <w:t>Even though selecting that second icon will allow you to quickly select keyframes. We are going to first add some easing, and to do that it is actually best to select the second icon.</w:t>
+        <w:t xml:space="preserve">Even though selecting that </w:t>
+      </w:r>
+      <w:r>
+        <w:t>third</w:t>
+      </w:r>
+      <w:r>
+        <w:t xml:space="preserve"> icon will allow you to quickly select keyframes. We are going to first add some easing, and to do that it is actually best to select the second icon.</w:t>
+      </w:r>
+      <w:r>
+        <w:t xml:space="preserve"> You will notice the visual for your keyframes in the panel has changed, and </w:t>
+      </w:r>
+      <w:r>
+        <w:t>looks more like a graph representation of our key frames.</w:t>
       </w:r>
     </w:p>
     <w:p>
@@ -496,6 +616,7 @@
         <w:rPr>
           <w:noProof/>
         </w:rPr>
+        <w:lastRenderedPageBreak/>
         <w:drawing>
           <wp:inline distT="0" distB="0" distL="0" distR="0" wp14:anchorId="47B0F61B" wp14:editId="6ADE42BF">
             <wp:extent cx="5734850" cy="3562847"/>
@@ -512,7 +633,7 @@
                     <pic:cNvPicPr/>
                   </pic:nvPicPr>
                   <pic:blipFill>
-                    <a:blip r:embed="rId15"/>
+                    <a:blip r:embed="rId16"/>
                     <a:stretch>
                       <a:fillRect/>
                     </a:stretch>
@@ -543,7 +664,6 @@
         <w:rPr>
           <w:noProof/>
         </w:rPr>
-        <w:lastRenderedPageBreak/>
         <w:drawing>
           <wp:inline distT="0" distB="0" distL="0" distR="0" wp14:anchorId="7B7343BF" wp14:editId="63E82911">
             <wp:extent cx="3467584" cy="2686425"/>
@@ -560,7 +680,7 @@
                     <pic:cNvPicPr/>
                   </pic:nvPicPr>
                   <pic:blipFill>
-                    <a:blip r:embed="rId16"/>
+                    <a:blip r:embed="rId17"/>
                     <a:stretch>
                       <a:fillRect/>
                     </a:stretch>
@@ -616,6 +736,7 @@
     </w:p>
     <w:p>
       <w:r>
+        <w:lastRenderedPageBreak/>
         <w:t xml:space="preserve"> </w:t>
       </w:r>
       <w:r>
@@ -638,7 +759,7 @@
                     <pic:cNvPicPr/>
                   </pic:nvPicPr>
                   <pic:blipFill>
-                    <a:blip r:embed="rId17"/>
+                    <a:blip r:embed="rId18"/>
                     <a:stretch>
                       <a:fillRect/>
                     </a:stretch>
@@ -669,7 +790,6 @@
         <w:rPr>
           <w:noProof/>
         </w:rPr>
-        <w:lastRenderedPageBreak/>
         <w:drawing>
           <wp:inline distT="0" distB="0" distL="0" distR="0" wp14:anchorId="04E65FB9" wp14:editId="06FD5496">
             <wp:extent cx="3400900" cy="2676899"/>
@@ -686,7 +806,7 @@
                     <pic:cNvPicPr/>
                   </pic:nvPicPr>
                   <pic:blipFill>
-                    <a:blip r:embed="rId18"/>
+                    <a:blip r:embed="rId19"/>
                     <a:stretch>
                       <a:fillRect/>
                     </a:stretch>
@@ -731,7 +851,19 @@
     </w:p>
     <w:p>
       <w:r>
-        <w:t>Bring in a new image to use that we can paste the keyframes into. And place the new image on the timeline next to the first movie clip with the sugar bowl in it.</w:t>
+        <w:t xml:space="preserve">Bring in a new image to use that we can paste the keyframes into. And place the new image on the </w:t>
+      </w:r>
+      <w:r>
+        <w:t xml:space="preserve">same track on the </w:t>
+      </w:r>
+      <w:r>
+        <w:t>timeline</w:t>
+      </w:r>
+      <w:r>
+        <w:t>,</w:t>
+      </w:r>
+      <w:r>
+        <w:t xml:space="preserve"> next to the first movie clip with the sugar bowl in it.</w:t>
       </w:r>
     </w:p>
     <w:p>
@@ -739,6 +871,7 @@
         <w:rPr>
           <w:noProof/>
         </w:rPr>
+        <w:lastRenderedPageBreak/>
         <w:drawing>
           <wp:inline distT="0" distB="0" distL="0" distR="0" wp14:anchorId="44B1AB6A" wp14:editId="2AC3CCF3">
             <wp:extent cx="5943600" cy="2564130"/>
@@ -755,7 +888,7 @@
                     <pic:cNvPicPr/>
                   </pic:nvPicPr>
                   <pic:blipFill>
-                    <a:blip r:embed="rId19"/>
+                    <a:blip r:embed="rId20"/>
                     <a:stretch>
                       <a:fillRect/>
                     </a:stretch>
@@ -786,7 +919,6 @@
         <w:rPr>
           <w:noProof/>
         </w:rPr>
-        <w:lastRenderedPageBreak/>
         <w:drawing>
           <wp:inline distT="0" distB="0" distL="0" distR="0" wp14:anchorId="5007CFDD" wp14:editId="0F03FCEA">
             <wp:extent cx="4267796" cy="3448531"/>
@@ -803,7 +935,7 @@
                     <pic:cNvPicPr/>
                   </pic:nvPicPr>
                   <pic:blipFill>
-                    <a:blip r:embed="rId20"/>
+                    <a:blip r:embed="rId21"/>
                     <a:stretch>
                       <a:fillRect/>
                     </a:stretch>
@@ -840,7 +972,22 @@
     </w:p>
     <w:p>
       <w:r>
-        <w:t>Go to the very top Menu and choose Edit- Copy</w:t>
+        <w:t xml:space="preserve">Go to the very </w:t>
+      </w:r>
+      <w:r>
+        <w:rPr>
+          <w:rStyle w:val="Strong"/>
+        </w:rPr>
+        <w:t>top Menu</w:t>
+      </w:r>
+      <w:r>
+        <w:t xml:space="preserve"> and choose </w:t>
+      </w:r>
+      <w:r>
+        <w:rPr>
+          <w:rStyle w:val="Strong"/>
+        </w:rPr>
+        <w:t>Edit- Copy</w:t>
       </w:r>
     </w:p>
     <w:p>
@@ -848,6 +995,7 @@
         <w:rPr>
           <w:noProof/>
         </w:rPr>
+        <w:lastRenderedPageBreak/>
         <w:drawing>
           <wp:inline distT="0" distB="0" distL="0" distR="0" wp14:anchorId="789CCB96" wp14:editId="1D5426EF">
             <wp:extent cx="3629025" cy="2114549"/>
@@ -864,7 +1012,7 @@
                     <pic:cNvPicPr/>
                   </pic:nvPicPr>
                   <pic:blipFill rotWithShape="1">
-                    <a:blip r:embed="rId21"/>
+                    <a:blip r:embed="rId22"/>
                     <a:srcRect t="3057"/>
                     <a:stretch>
                       <a:fillRect/>
@@ -924,7 +1072,28 @@
     </w:p>
     <w:p>
       <w:r>
-        <w:t xml:space="preserve">Now click on the blue teapot clip on the timeline and choose Edit Paste. And </w:t>
+        <w:t xml:space="preserve">Now click on the blue teapot clip on the timeline and choose </w:t>
+      </w:r>
+      <w:r>
+        <w:rPr>
+          <w:rStyle w:val="Strong"/>
+        </w:rPr>
+        <w:t>Edit</w:t>
+      </w:r>
+      <w:r>
+        <w:rPr>
+          <w:rStyle w:val="Strong"/>
+        </w:rPr>
+        <w:t>-</w:t>
+      </w:r>
+      <w:r>
+        <w:rPr>
+          <w:rStyle w:val="Strong"/>
+        </w:rPr>
+        <w:t xml:space="preserve"> Paste</w:t>
+      </w:r>
+      <w:r>
+        <w:t xml:space="preserve">. And </w:t>
       </w:r>
       <w:proofErr w:type="spellStart"/>
       <w:r>
@@ -940,7 +1109,6 @@
         <w:rPr>
           <w:noProof/>
         </w:rPr>
-        <w:lastRenderedPageBreak/>
         <w:drawing>
           <wp:inline distT="0" distB="0" distL="0" distR="0" wp14:anchorId="7AE13734" wp14:editId="3F9A0222">
             <wp:extent cx="5943600" cy="2553335"/>
@@ -957,7 +1125,7 @@
                     <pic:cNvPicPr/>
                   </pic:nvPicPr>
                   <pic:blipFill>
-                    <a:blip r:embed="rId22"/>
+                    <a:blip r:embed="rId23"/>
                     <a:stretch>
                       <a:fillRect/>
                     </a:stretch>
@@ -992,8 +1160,13 @@
         </w:drawing>
       </w:r>
     </w:p>
+    <w:p>
+      <w:r>
+        <w:t>Copying and pasting keyframes on the Edit page may seem simple, but it’s one of those small techniques that unlocks big creative freedom. Once you understand how to duplicate motion or timing between clips, you can build smoother transitions, consistent animations, and a more polished overall look without redoing your work. Think of it as learning to “borrow” your own rhythm — a skill that keeps your edits flowing naturally and saves time for the fun parts of storytelling.</w:t>
+      </w:r>
+    </w:p>
     <w:sectPr>
-      <w:headerReference w:type="default" r:id="rId23"/>
+      <w:headerReference w:type="default" r:id="rId24"/>
       <w:pgSz w:w="12240" w:h="15840"/>
       <w:pgMar w:top="1440" w:right="1440" w:bottom="1440" w:left="1440" w:header="720" w:footer="720" w:gutter="0"/>
       <w:cols w:space="720"/>

</xml_diff>